<commit_message>
K3-39: tekst uzasadnienia kosztu Anotatorow Z2 w zestawieniu zmian (poz. 3.4), N12, T49
Co-Authored-By: Claude Sonnet 5.5 <noreply@anthropic.com>
Claude-Session: https://claude.ai/code/session_01672WnJhixnEcarbb7uiwfx
</commit_message>
<xml_diff>
--- a/Zmiany_do_wprowadzenia_w_plikach_zamknietych.docx
+++ b/Zmiany_do_wprowadzenia_w_plikach_zamknietych.docx
@@ -947,6 +947,68 @@
           </w:p>
         </w:tc>
       </w:tr>
+      <w:tr>
+        <w:tc>
+          <w:tcPr>
+            <w:tcW w:type="dxa" w:w="567"/>
+          </w:tcPr>
+          <w:p>
+            <w:r/>
+            <w:r>
+              <w:rPr>
+                <w:b w:val="0"/>
+                <w:sz w:val="18"/>
+              </w:rPr>
+              <w:t>3.4</w:t>
+            </w:r>
+          </w:p>
+        </w:tc>
+        <w:tc>
+          <w:tcPr>
+            <w:tcW w:type="dxa" w:w="1928"/>
+          </w:tcPr>
+          <w:p>
+            <w:r/>
+            <w:r>
+              <w:rPr>
+                <w:b w:val="0"/>
+                <w:sz w:val="18"/>
+              </w:rPr>
+              <w:t>Pole 3.1.2 „Uzasadnienie kosztu: Anotatorzy - wynagrodzenie (Z2)” (K3-39; nowy tekst ma 1378 znaków, limit 1500)</w:t>
+            </w:r>
+          </w:p>
+        </w:tc>
+        <w:tc>
+          <w:tcPr>
+            <w:tcW w:type="dxa" w:w="2948"/>
+          </w:tcPr>
+          <w:p>
+            <w:r/>
+            <w:r>
+              <w:rPr>
+                <w:b w:val="0"/>
+                <w:sz w:val="18"/>
+              </w:rPr>
+              <w:t>Dotychczasowy tekst (888 znaków) nie podaje formy zatrudnienia, nie wskazuje, kto nadzoruje jakość anotacji, ani że taksonomię i protokół opracowuje PRz w Z3</w:t>
+            </w:r>
+          </w:p>
+        </w:tc>
+        <w:tc>
+          <w:tcPr>
+            <w:tcW w:type="dxa" w:w="4309"/>
+          </w:tcPr>
+          <w:p>
+            <w:r/>
+            <w:r>
+              <w:rPr>
+                <w:b w:val="0"/>
+                <w:sz w:val="18"/>
+              </w:rPr>
+              <w:t>Everest11 zatrudni trzech anotatorów na umowę zlecenia, każdego w wymiarze 1,0 etatu przez 10 miesięcy (M9-M18), razem ok. 5 040 godzin w zadaniu Z2. Anotatorzy wykonają anotację co najmniej 15 000 klatek RGB metodą segmentacji instancji w standardzie COCO według taksonomii klas zabezpieczeń TSL i protokołu zbioru, które w zadaniu Z3 opracuje PRz, oraz według schematu anotacji przygotowanego przez AI Lead i AI Senior Engineer Everest11. Nakład wynosi około 11-12 minut na klatkę w gęstych scenach, do czego dochodzą reanotacja po kontroli jakości i niezależna anotacja próby co najmniej 10% klatek. Jakość będzie nadzorowana dwuetapowo: AI Lead zmierzy zgodność anotatorów współczynnikiem Cohena (wymagane co najmniej 0,80; przy niższej wartości próba i klasy o skupionych rozbieżnościach zostaną zaanotowane ponownie), a specjalista ds. logistyki TSL zatwierdzi etykietę referencyjną przy rozbieżnościach. Anotatorzy będą zgłaszać przypadki niejednoznaczne, które posłużą PRz do walidacji taksonomii w zadaniu Z3 (próba pilotażowa w M10). Ich praca jest bezpośrednim udziałem w badaniach przemysłowych, ponieważ wytwarza zbiór referencyjny i dane do pomiaru zgodności, a nie samą techniczną obróbkę datasetu. Zakres stanowiska ma wyłącznie charakter badawczo-rozwojowy i nie obejmuje czynności zarządczych, kierowniczych, koordynacyjnych, administracyjnych ani nadzorczych.</w:t>
+            </w:r>
+          </w:p>
+        </w:tc>
+      </w:tr>
     </w:tbl>
     <w:p/>
     <w:p>

</xml_diff>

<commit_message>
K3-33: pozycje 5.1-5.3 w zestawieniu zmian (AI Lead, PRz, koszty posrednie kierownikow), T50
Co-Authored-By: Claude Sonnet 5.5 <noreply@anthropic.com>
Claude-Session: https://claude.ai/code/session_01672WnJhixnEcarbb7uiwfx
</commit_message>
<xml_diff>
--- a/Zmiany_do_wprowadzenia_w_plikach_zamknietych.docx
+++ b/Zmiany_do_wprowadzenia_w_plikach_zamknietych.docx
@@ -1016,7 +1016,277 @@
         <w:pStyle w:val="Heading1"/>
       </w:pPr>
       <w:r>
-        <w:t>5. Pola we wniosku (LSI) poza plikami</w:t>
+        <w:t>5. Sekcja_6.1_zespol_projektowy.docx (uwaga K3-33)</w:t>
+      </w:r>
+    </w:p>
+    <w:tbl>
+      <w:tblPr>
+        <w:tblStyle w:val="TableGrid"/>
+        <w:tblW w:type="auto" w:w="0"/>
+        <w:tblLook w:firstColumn="1" w:firstRow="1" w:lastColumn="0" w:lastRow="0" w:noHBand="0" w:noVBand="1" w:val="04A0"/>
+      </w:tblPr>
+      <w:tblGrid>
+        <w:gridCol w:w="2409"/>
+        <w:gridCol w:w="2409"/>
+        <w:gridCol w:w="2409"/>
+        <w:gridCol w:w="2409"/>
+      </w:tblGrid>
+      <w:tr>
+        <w:tc>
+          <w:tcPr>
+            <w:tcW w:type="dxa" w:w="567"/>
+          </w:tcPr>
+          <w:p>
+            <w:r/>
+            <w:r>
+              <w:rPr>
+                <w:b/>
+                <w:sz w:val="18"/>
+              </w:rPr>
+              <w:t>Nr</w:t>
+            </w:r>
+          </w:p>
+        </w:tc>
+        <w:tc>
+          <w:tcPr>
+            <w:tcW w:type="dxa" w:w="2381"/>
+          </w:tcPr>
+          <w:p>
+            <w:r/>
+            <w:r>
+              <w:rPr>
+                <w:b/>
+                <w:sz w:val="18"/>
+              </w:rPr>
+              <w:t>Miejsce</w:t>
+            </w:r>
+          </w:p>
+        </w:tc>
+        <w:tc>
+          <w:tcPr>
+            <w:tcW w:type="dxa" w:w="2835"/>
+          </w:tcPr>
+          <w:p>
+            <w:r/>
+            <w:r>
+              <w:rPr>
+                <w:b/>
+                <w:sz w:val="18"/>
+              </w:rPr>
+              <w:t>Dotychczasowy zapis</w:t>
+            </w:r>
+          </w:p>
+        </w:tc>
+        <w:tc>
+          <w:tcPr>
+            <w:tcW w:type="dxa" w:w="3969"/>
+          </w:tcPr>
+          <w:p>
+            <w:r/>
+            <w:r>
+              <w:rPr>
+                <w:b/>
+                <w:sz w:val="18"/>
+              </w:rPr>
+              <w:t>Nowy zapis</w:t>
+            </w:r>
+          </w:p>
+        </w:tc>
+      </w:tr>
+      <w:tr>
+        <w:tc>
+          <w:tcPr>
+            <w:tcW w:type="dxa" w:w="567"/>
+          </w:tcPr>
+          <w:p>
+            <w:r/>
+            <w:r>
+              <w:rPr>
+                <w:b w:val="0"/>
+                <w:sz w:val="18"/>
+              </w:rPr>
+              <w:t>5.1</w:t>
+            </w:r>
+          </w:p>
+        </w:tc>
+        <w:tc>
+          <w:tcPr>
+            <w:tcW w:type="dxa" w:w="2381"/>
+          </w:tcPr>
+          <w:p>
+            <w:r/>
+            <w:r>
+              <w:rPr>
+                <w:b w:val="0"/>
+                <w:sz w:val="18"/>
+              </w:rPr>
+              <w:t>Pole zakresu obowiązków Jakuba Kosterny (AI Lead), na końcu</w:t>
+            </w:r>
+          </w:p>
+        </w:tc>
+        <w:tc>
+          <w:tcPr>
+            <w:tcW w:type="dxa" w:w="2835"/>
+          </w:tcPr>
+          <w:p>
+            <w:r/>
+            <w:r>
+              <w:rPr>
+                <w:b w:val="0"/>
+                <w:sz w:val="18"/>
+              </w:rPr>
+              <w:t>Brak jednoznacznej deklaracji o funkcjach zarządczych i nadzorczych (jest tylko zdanie „Prace będą wyłącznie badawczo-rozwojowe”).</w:t>
+            </w:r>
+          </w:p>
+        </w:tc>
+        <w:tc>
+          <w:tcPr>
+            <w:tcW w:type="dxa" w:w="3969"/>
+          </w:tcPr>
+          <w:p>
+            <w:r/>
+            <w:r>
+              <w:rPr>
+                <w:b w:val="0"/>
+                <w:sz w:val="18"/>
+              </w:rPr>
+              <w:t>Jakub Kosterna nie pełni w Everest11 funkcji zarządczych, kierowniczych, koordynacyjnych, administracyjnych ani nadzorczych i nie będzie ich pełnił w projekcie. Jako AI Lead wykona wyłącznie prace badawczo-rozwojowe: zaprojektuje architekturę potoku danych i schemat anotacji, a ocena zgodności anotatorów i przeliczenie metryk PRz na zamrożonym zbiorze są pomiarami wyników badań, a nie kierowaniem zespołem ani nadzorem nad pracownikami. Wymaga potwierdzenia właścicielki, że Jakub Kosterna nie jest członkiem zarządu ani nie kieruje zespołem w Everest11.</w:t>
+            </w:r>
+          </w:p>
+        </w:tc>
+      </w:tr>
+      <w:tr>
+        <w:tc>
+          <w:tcPr>
+            <w:tcW w:type="dxa" w:w="567"/>
+          </w:tcPr>
+          <w:p>
+            <w:r/>
+            <w:r>
+              <w:rPr>
+                <w:b w:val="0"/>
+                <w:sz w:val="18"/>
+              </w:rPr>
+              <w:t>5.2</w:t>
+            </w:r>
+          </w:p>
+        </w:tc>
+        <w:tc>
+          <w:tcPr>
+            <w:tcW w:type="dxa" w:w="2381"/>
+          </w:tcPr>
+          <w:p>
+            <w:r/>
+            <w:r>
+              <w:rPr>
+                <w:b w:val="0"/>
+                <w:sz w:val="18"/>
+              </w:rPr>
+              <w:t>Pole zakresu obowiązków pięciu osób PRz (Batsch, Nowak, Włoch, Kusy, Król): zdanie dopisane dla każdej osoby</w:t>
+            </w:r>
+          </w:p>
+        </w:tc>
+        <w:tc>
+          <w:tcPr>
+            <w:tcW w:type="dxa" w:w="2835"/>
+          </w:tcPr>
+          <w:p>
+            <w:r/>
+            <w:r>
+              <w:rPr>
+                <w:b w:val="0"/>
+                <w:sz w:val="18"/>
+              </w:rPr>
+              <w:t>Brak deklaracji. Dla Andrzeja Włocha uwaga wymienia tytuł prof. dr hab., a w naszych plikach jest dr hab.; tytuł i ewentualne funkcje na uczelni (np. kierownik katedry, dziekan, prodziekan) wskaże PRz.</w:t>
+            </w:r>
+          </w:p>
+        </w:tc>
+        <w:tc>
+          <w:tcPr>
+            <w:tcW w:type="dxa" w:w="3969"/>
+          </w:tcPr>
+          <w:p>
+            <w:r/>
+            <w:r>
+              <w:rPr>
+                <w:b w:val="0"/>
+                <w:sz w:val="18"/>
+              </w:rPr>
+              <w:t>Osoba ta wykona w projekcie wyłącznie prace badawczo-rozwojowe w zadaniach Z1, Z3, Z4, Z5 i Z8 wskazanych w opisie zadań. Nie pełni w projekcie ani w Politechnice Rzeszowskiej funkcji zarządczych, kierowniczych, koordynacyjnych, administracyjnych ani nadzorczych, a wynagrodzenie z projektu nie obejmuje takich czynności. Wklejamy po pisemnym potwierdzeniu przez PRz. Jeśli któraś osoba pełni funkcję kierowniczą na uczelni, jej zapis zmieniamy według wskazania PRz.</w:t>
+            </w:r>
+          </w:p>
+        </w:tc>
+      </w:tr>
+      <w:tr>
+        <w:tc>
+          <w:tcPr>
+            <w:tcW w:type="dxa" w:w="567"/>
+          </w:tcPr>
+          <w:p>
+            <w:r/>
+            <w:r>
+              <w:rPr>
+                <w:b w:val="0"/>
+                <w:sz w:val="18"/>
+              </w:rPr>
+              <w:t>5.3</w:t>
+            </w:r>
+          </w:p>
+        </w:tc>
+        <w:tc>
+          <w:tcPr>
+            <w:tcW w:type="dxa" w:w="2381"/>
+          </w:tcPr>
+          <w:p>
+            <w:r/>
+            <w:r>
+              <w:rPr>
+                <w:b w:val="0"/>
+                <w:sz w:val="18"/>
+              </w:rPr>
+              <w:t>Pole „Sposób zarządzania projektem”, na końcu akapitu o kierownikach (zdanie od „Kierownik B+R i kierownik zarządzający są pracownikami PRz…”)</w:t>
+            </w:r>
+          </w:p>
+        </w:tc>
+        <w:tc>
+          <w:tcPr>
+            <w:tcW w:type="dxa" w:w="2835"/>
+          </w:tcPr>
+          <w:p>
+            <w:r/>
+            <w:r>
+              <w:rPr>
+                <w:b w:val="0"/>
+                <w:sz w:val="18"/>
+              </w:rPr>
+              <w:t>Zdanie o braku funkcji zarządczych w PRz, bez informacji o kategorii kosztu.</w:t>
+            </w:r>
+          </w:p>
+        </w:tc>
+        <w:tc>
+          <w:tcPr>
+            <w:tcW w:type="dxa" w:w="3969"/>
+          </w:tcPr>
+          <w:p>
+            <w:r/>
+            <w:r>
+              <w:rPr>
+                <w:b w:val="0"/>
+                <w:sz w:val="18"/>
+              </w:rPr>
+              <w:t>Dopisać: „Wynagrodzenie kierownika B+R, kierownika zarządzającego i zastępcy kierownika zarządzającego zostanie ujęte w kosztach pośrednich, a nie w kategorii „Personel projektu”.”</w:t>
+            </w:r>
+          </w:p>
+        </w:tc>
+      </w:tr>
+    </w:tbl>
+    <w:p/>
+    <w:p>
+      <w:pPr>
+        <w:pStyle w:val="Heading1"/>
+      </w:pPr>
+      <w:r>
+        <w:t>6. Pola we wniosku (LSI) poza plikami</w:t>
       </w:r>
     </w:p>
     <w:tbl>

</xml_diff>

<commit_message>
K3-33: Wloch jako kierownik Zakladu (Przewodnik 3.3.1/3.3.9), poz. 5.4, N86, E30
Co-Authored-By: Claude Sonnet 5.5 <noreply@anthropic.com>
Claude-Session: https://claude.ai/code/session_01672WnJhixnEcarbb7uiwfx
</commit_message>
<xml_diff>
--- a/Zmiany_do_wprowadzenia_w_plikach_zamknietych.docx
+++ b/Zmiany_do_wprowadzenia_w_plikach_zamknietych.docx
@@ -1182,7 +1182,7 @@
                 <w:b w:val="0"/>
                 <w:sz w:val="18"/>
               </w:rPr>
-              <w:t>Pole zakresu obowiązków pięciu osób PRz (Batsch, Nowak, Włoch, Kusy, Król): zdanie dopisane dla każdej osoby</w:t>
+              <w:t>Pole zakresu obowiązków czterech osób PRz (Batsch, Nowak, Kusy, Król): zdanie dopisane dla każdej osoby</w:t>
             </w:r>
           </w:p>
         </w:tc>
@@ -1197,7 +1197,7 @@
                 <w:b w:val="0"/>
                 <w:sz w:val="18"/>
               </w:rPr>
-              <w:t>Brak deklaracji. Dla Andrzeja Włocha uwaga wymienia tytuł prof. dr hab., a w naszych plikach jest dr hab.; tytuł i ewentualne funkcje na uczelni (np. kierownik katedry, dziekan, prodziekan) wskaże PRz.</w:t>
+              <w:t>Brak deklaracji. W biografiach z wniosku żadna z tych osób nie ma wskazanej funkcji kierowniczej na uczelni (Batsch i Nowak to adiunkci, Kusy profesor uczelni w Katedrze, Król asystentka).</w:t>
             </w:r>
           </w:p>
         </w:tc>
@@ -1212,7 +1212,7 @@
                 <w:b w:val="0"/>
                 <w:sz w:val="18"/>
               </w:rPr>
-              <w:t>Osoba ta wykona w projekcie wyłącznie prace badawczo-rozwojowe w zadaniach Z1, Z3, Z4, Z5 i Z8 wskazanych w opisie zadań. Nie pełni w projekcie ani w Politechnice Rzeszowskiej funkcji zarządczych, kierowniczych, koordynacyjnych, administracyjnych ani nadzorczych, a wynagrodzenie z projektu nie obejmuje takich czynności. Wklejamy po pisemnym potwierdzeniu przez PRz. Jeśli któraś osoba pełni funkcję kierowniczą na uczelni, jej zapis zmieniamy według wskazania PRz.</w:t>
+              <w:t>Osoba ta wykona w projekcie wyłącznie prace badawczo-rozwojowe w zadaniach Z1, Z3, Z4, Z5 i Z8 wskazanych w opisie zadań. Nie pełni w projekcie ani w Politechnice Rzeszowskiej funkcji zarządczych, kierowniczych, koordynacyjnych, administracyjnych ani nadzorczych, a wynagrodzenie z projektu nie obejmuje takich czynności. Wklejamy po pisemnym potwierdzeniu przez PRz, że żadna z czterech osób nie pełni funkcji zarządczych ani kierowniczych na uczelni.</w:t>
             </w:r>
           </w:p>
         </w:tc>
@@ -1275,6 +1275,68 @@
                 <w:sz w:val="18"/>
               </w:rPr>
               <w:t>Dopisać: „Wynagrodzenie kierownika B+R, kierownika zarządzającego i zastępcy kierownika zarządzającego zostanie ujęte w kosztach pośrednich, a nie w kategorii „Personel projektu”.”</w:t>
+            </w:r>
+          </w:p>
+        </w:tc>
+      </w:tr>
+      <w:tr>
+        <w:tc>
+          <w:tcPr>
+            <w:tcW w:type="dxa" w:w="567"/>
+          </w:tcPr>
+          <w:p>
+            <w:r/>
+            <w:r>
+              <w:rPr>
+                <w:b w:val="0"/>
+                <w:sz w:val="18"/>
+              </w:rPr>
+              <w:t>5.4</w:t>
+            </w:r>
+          </w:p>
+        </w:tc>
+        <w:tc>
+          <w:tcPr>
+            <w:tcW w:type="dxa" w:w="2381"/>
+          </w:tcPr>
+          <w:p>
+            <w:r/>
+            <w:r>
+              <w:rPr>
+                <w:b w:val="0"/>
+                <w:sz w:val="18"/>
+              </w:rPr>
+              <w:t>Biografia i zakres obowiązków Andrzeja Włocha (PRz); pozycje kosztowe 3.1.2: Z1, Z3, Z4, Z5, Z8</w:t>
+            </w:r>
+          </w:p>
+        </w:tc>
+        <w:tc>
+          <w:tcPr>
+            <w:tcW w:type="dxa" w:w="2835"/>
+          </w:tcPr>
+          <w:p>
+            <w:r/>
+            <w:r>
+              <w:rPr>
+                <w:b w:val="0"/>
+                <w:sz w:val="18"/>
+              </w:rPr>
+              <w:t>Biografia: „profesor uczelni, kierownik Zakładu Modelowania Matematycznego Politechniki Rzeszowskiej”, a koszt w kategorii „Personel projektu”.</w:t>
+            </w:r>
+          </w:p>
+        </w:tc>
+        <w:tc>
+          <w:tcPr>
+            <w:tcW w:type="dxa" w:w="3969"/>
+          </w:tcPr>
+          <w:p>
+            <w:r/>
+            <w:r>
+              <w:rPr>
+                <w:b w:val="0"/>
+                <w:sz w:val="18"/>
+              </w:rPr>
+              <w:t>Dr hab. Andrzej Włoch jest w biografii z wniosku opisany jako „profesor uczelni, kierownik Zakładu Modelowania Matematycznego Politechniki Rzeszowskiej”. Przewodnik kwalifikowalności (pkt 3.3.1 i 3.3.9) wyłącza z kategorii „Personel projektu” każdego, kto zarządza, nadzoruje lub koordynuje u Lidera albo konsorcjanta, a koszt takiej osoby może być rozliczony wyłącznie w kosztach pośrednich, bez podziału na część B+R. Do decyzji, po uzyskaniu odpowiedzi PRz, dwa warianty. Wariant A (PRz potwierdza, że kieruje Zakładem): wynagrodzenie Andrzeja Włocha znika z kategorii „Personel projektu” PRz (Z1 11 016,00 zł, Z3 37 087,20 zł, Z4 17 442,00 zł, Z5 6 976,80 zł, Z8 9 271,80 zł, razem 81 793,80 zł, 900 godzin), a w kosztach pośrednich nie jest finansowane odrębnie, bo są ryczałtem 25%. Koszty bezpośrednie PRz spadają o 81 793,80 zł, a koszty pośrednie o 20 448,45 zł, razem o 102 242,25 zł. Dofinansowanie nie rośnie. Zadania modelowania i walidacji statystycznej trzeba przypisać innym osobom z PRz bez zwiększenia budżetu (do ustalenia z PRz). Wariant B (PRz potwierdza na piśmie, że nie pełni ani nie pełnił funkcji kierowniczej w okresie projektu): w biografii z wniosku usunąć słowa „kierownik Zakładu Modelowania Matematycznego”, a w polu zakresu obowiązków dopisać zdanie z poz. 5.2. Wariant dopuszczalny tylko, jeśli opis w obecnym wniosku jest nieprawdziwy albo nieaktualny.</w:t>
             </w:r>
           </w:p>
         </w:tc>

</xml_diff>

<commit_message>
Zmiany cz. 8: docelowe R11, R12 i budzet Z10/Z11 (3.2.3, 3.2.5); korekta K14-01 i CEE; rejestr N101-N102, T56, E34
Co-Authored-By: Claude Sonnet 5.5 <noreply@anthropic.com>
Claude-Session: https://claude.ai/code/session_01672WnJhixnEcarbb7uiwfx
</commit_message>
<xml_diff>
--- a/Zmiany_do_wprowadzenia_w_plikach_zamknietych.docx
+++ b/Zmiany_do_wprowadzenia_w_plikach_zamknietych.docx
@@ -1577,7 +1577,7 @@
         <w:rPr>
           <w:b w:val="0"/>
         </w:rPr>
-        <w:t xml:space="preserve"> Ma 5 problemów wysokiej wagi (poz. 1, 2, 3, 5 i 11 w tabeli 7.3), które albo przeczą naszym decyzjom, albo podają w LSI treść niezgodną z faktami, albo nie dotyczą tekstu, który jest w LSI.</w:t>
+        <w:t xml:space="preserve"> Ma 4 problemy wysokiej wagi (poz. 1, 2, 3 i 5 w tabeli 7.3), które albo przeczą naszym decyzjom, albo podają w LSI treść niezgodną z faktami, albo nie dotyczą tekstu, który jest w LSI.</w:t>
       </w:r>
     </w:p>
     <w:p>
@@ -2454,7 +2454,7 @@
                 <w:b w:val="0"/>
                 <w:sz w:val="18"/>
               </w:rPr>
-              <w:t>NIE</w:t>
+              <w:t>Poza plikiem (rozwiązana wcześniej)</w:t>
             </w:r>
           </w:p>
         </w:tc>
@@ -2469,7 +2469,7 @@
                 <w:b w:val="0"/>
                 <w:sz w:val="18"/>
               </w:rPr>
-              <w:t>Plik tego nie zmienia, a w 3.2.1 odsyła do wskaźnika z 8.2 (poz. 11).</w:t>
+              <w:t>Decyzja D40 i Sekcja_3.2 część 6: wartość 0 zł w 2030 r. Plik LSI jest z tym spójny (3.2.1 odsyła do wskaźnika z 8.2), ale pole 8.2 trzeba jeszcze wkleić z Sekcja_3.2, bo w wersji C nadal jest 489 300 zł (poz. 11).</w:t>
             </w:r>
           </w:p>
         </w:tc>
@@ -2862,7 +2862,7 @@
                 <w:b w:val="0"/>
                 <w:sz w:val="18"/>
               </w:rPr>
-              <w:t>Zdania o CEE są sprzeczne. 1.3 mówi, że pojazdy w CEE „obniżają udział w polskim SAM poniżej 0,50%”, 2.3 mówi, że penetracja SAM w Polsce w 2034 r. wyniesie 0,50%, 2.4 zmienia SAM na „w Polsce”. Model nie zakłada żadnej sprzedaży zagranicznej, a 3.2.1 mówi, że w 2030 r. nie ma przychodów poza RP, co sugeruje, że później są.</w:t>
+              <w:t>Zdania o CEE są sprzeczne. 1.3 mówi, że pojazdy w CEE „obniżają udział w polskim SAM poniżej 0,50%”, 2.3 mówi, że penetracja SAM w Polsce w 2034 r. wyniesie 0,50%, 2.4 zmienia SAM na „w Polsce”. Model nie rozdziela przychodów na kraje, a mój komentarz do arkusza Przychody mówi, że sprzedaż zagraniczna nie została założona, natomiast Sekcja_3.2 (część 6) i D40 mówią, że przychody poza RP wynikają z modelu od 2032-2033. 3.2.1 sugeruje, że po 2030 r. przychody zagraniczne są.</w:t>
             </w:r>
           </w:p>
         </w:tc>
@@ -2877,7 +2877,7 @@
                 <w:b w:val="0"/>
                 <w:sz w:val="18"/>
               </w:rPr>
-              <w:t>Ujednolicić: „W prognozie 1 000 pojazdów w 2034 r. to sprzedaż w Polsce, czyli 0,50% SAM i 0,18% TAM; sprzedaży w CEE nie zakładamy, a ewentualne licencje API dla dostawców TMS w CEE byłyby uzupełnieniem poza prognozą.” Dotyczy też K14-01 (poz. 11).</w:t>
+              <w:t>Ujednolicić: „W prognozie 1 000 pojazdów w 2034 r. to sprzedaż w Polsce, czyli 0,50% SAM i 0,18% TAM; sprzedaży w CEE nie zakładamy, a ewentualne licencje API dla dostawców TMS w CEE byłyby uzupełnieniem poza prognozą.” Poprawić też zdanie w Sekcja_3.2 część 6 (poz. 11).</w:t>
             </w:r>
           </w:p>
         </w:tc>
@@ -3371,7 +3371,7 @@
                 <w:b w:val="0"/>
                 <w:sz w:val="18"/>
               </w:rPr>
-              <w:t>WYSOKA</w:t>
+              <w:t>ŚREDNIA</w:t>
             </w:r>
           </w:p>
         </w:tc>
@@ -3386,7 +3386,7 @@
                 <w:b w:val="0"/>
                 <w:sz w:val="18"/>
               </w:rPr>
-              <w:t>3.2.1 („o czym mówi wskaźnik w sekcji 8.2”); Z10; model</w:t>
+              <w:t>3.2.1 („o czym mówi wskaźnik w sekcji 8.2”); pole 8.2 w LSI</w:t>
             </w:r>
           </w:p>
         </w:tc>
@@ -3401,7 +3401,7 @@
                 <w:b w:val="0"/>
                 <w:sz w:val="18"/>
               </w:rPr>
-              <w:t>K14-01: rok osiągnięcia wskaźnika „Przychody ze sprzedaży poza RP” ma być pierwszym rokiem po zakończeniu projektu (2030). Plik mówi, że w 2030 poza RP nie ma sprzedaży, model nie zakłada sprzedaży zagranicznej, a 2.3 mówi o licencjach CEE od 2032. Uwaga pozostaje otwarta, a plik odsyła do wskaźnika, którego nie zmienia.</w:t>
+              <w:t>K14-01 jest rozwiązana wcześniej: D40 (zatwierdzona 02.10) i Sekcja_3.2 część 6 dają wartość 0 zł w 2030 r. (rok po zakończeniu projektu) z metodologią. Plik LSI jest z tym spójny, ale w wersji C pole 8.2 nadal ma 489 300 zł, więc trzeba je wkleić. W samej Sekcja_3.2 jest błąd: zdanie, że pierwsze przychody poza RP „wynikają z modelu od 2032-2033”, nie ma pokrycia w modelu (poz. 4).</w:t>
             </w:r>
           </w:p>
         </w:tc>
@@ -3416,7 +3416,7 @@
                 <w:b w:val="0"/>
                 <w:sz w:val="18"/>
               </w:rPr>
-              <w:t>Decyzja (D58): albo wskaźnik z wartością w 2030 (np. pierwsza licencja API dla dostawcy TMS w CEE) i odpowiedni wiersz w modelu, albo uzasadnienie, że nie dotyczy (wtedy zapytać instytucję, bo moduł Internacjonalizacja tego wymaga). Do czasu decyzji usunąć z 3.2.1 odesłanie do 8.2.</w:t>
+              <w:t>Wkleić 8.2 z Sekcja_3.2 część 6, zamieniając zdanie o modelu na: „Przychodów poza RP nie zakładamy w prognozie; ewentualne licencje API dla dostawców TMS w CEE (cel Z10, od 2032 r.) byłyby uzupełnieniem poza prognozą.” Ryzyko komentarza eksperta przy wartości 0 zostało zaakceptowane w D40.</w:t>
             </w:r>
           </w:p>
         </w:tc>
@@ -4004,6 +4004,1199 @@
         <w:t xml:space="preserve"> Z1, Z3, Z5, Z7 (gwiazdki, D06), R10 (poz. 6), R11 i R12 (poz. 2), 1.3 część VI i 2.3 (poz. 1 i 4), 3.2.1 (poz. 11), 6.1 i 3.1.2 (poz. 3).</w:t>
       </w:r>
     </w:p>
+    <w:p>
+      <w:pPr>
+        <w:pStyle w:val="Heading1"/>
+      </w:pPr>
+      <w:r>
+        <w:t>8. Jak powinny wyglądać R11, R12 i budżet Z10 (propozycja docelowa)</w:t>
+      </w:r>
+    </w:p>
+    <w:p>
+      <w:r>
+        <w:rPr>
+          <w:b w:val="0"/>
+        </w:rPr>
+        <w:t xml:space="preserve">Odpowiedź na pytanie, jak mają wyglądać pola, które w części 7 oceniłam jako „są, ale nie według D47 i D48” (R11, R12) albo „poza plikiem” (budżet 3.2.3). </w:t>
+      </w:r>
+      <w:r>
+        <w:rPr>
+          <w:b/>
+        </w:rPr>
+        <w:t>R1 do R5, R9 i R10 z pliku LSI zostawiamy bez zmian</w:t>
+      </w:r>
+      <w:r>
+        <w:rPr>
+          <w:b w:val="0"/>
+        </w:rPr>
+        <w:t>: mają wartości minimalne, liczbę iteracji, moment decyzji i skutki dla wskaźników, a R10 sześć zagrożeń z prawdopodobieństwem, więc odpowiadają na K3-25 do K3-30.</w:t>
+      </w:r>
+    </w:p>
+    <w:p>
+      <w:pPr>
+        <w:pStyle w:val="Heading2"/>
+      </w:pPr>
+      <w:r>
+        <w:t>8.1 R11, pole „Opis ryzyka” (limit 2000)</w:t>
+      </w:r>
+    </w:p>
+    <w:p>
+      <w:pPr>
+        <w:keepNext/>
+        <w:spacing w:before="160" w:after="40"/>
+      </w:pPr>
+      <w:r>
+        <w:rPr>
+          <w:b/>
+          <w:sz w:val="20"/>
+        </w:rPr>
+        <w:t>R11 › Opis ryzyka</w:t>
+      </w:r>
+      <w:r>
+        <w:rPr>
+          <w:color w:val="666666"/>
+          <w:sz w:val="17"/>
+        </w:rPr>
+        <w:t xml:space="preserve"> [1163 znaków]</w:t>
+      </w:r>
+    </w:p>
+    <w:p>
+      <w:pPr>
+        <w:spacing w:after="60"/>
+      </w:pPr>
+      <w:r>
+        <w:rPr>
+          <w:b w:val="0"/>
+        </w:rPr>
+        <w:t>Ryzyko dotyczy zadań Z2 (akwizycja) i Z9 (walidacja terenowa). Montaż i dane z obu zadań zależą od dostępu do co najmniej 3 pojazdów partnera testowego, Natanek Logistics, na podstawie umowy partnerskiej. Natanek Logistics jest jednocześnie głównym dostawcą usług transportowych Everest11 (ok. 95% zakupów usług), podmiotem powiązanym z przyszłym Inwestorem i jednym z trzech operatorów, którzy podpisali listy intencyjne (20 z 50 naczep), więc utrata albo ograniczenie dostępu może wynikać nie tylko z przyczyn technicznych, ale też ze zmiany relacji biznesowej. Zagrożeniem jest wycofanie pojazdów, ograniczenia ubezpieczeniowe, brak zgody na instalację sprzętu eksperymentalnego albo ograniczony dostęp do danych o ładunkach i dokumentacji inspekcyjnej. Prawdopodobieństwo jest niskie, bo umowa jest podpisana, a wpływ wysoki. Skutkiem byłoby zagrożenie liczności zbioru w zadaniu Z2 (co najmniej 500 h i 50 kursów), walidacji terenowej w zadaniu Z9 (co najmniej 180 kursów), KPI oraz kamieni milowych KM-Z2 i KM-Z9, z opóźnieniem o czas pozyskania nowego partnera i montażu, około 6-10 tygodni. Skala zależności od Natanek Logistics jest opisana w ryzyku R12.</w:t>
+      </w:r>
+    </w:p>
+    <w:p>
+      <w:pPr>
+        <w:pStyle w:val="Heading2"/>
+      </w:pPr>
+      <w:r>
+        <w:t>8.2 R11, pole „Sposoby zapobiegania i minimalizacji skutków” (limit 2000)</w:t>
+      </w:r>
+    </w:p>
+    <w:p>
+      <w:pPr>
+        <w:keepNext/>
+        <w:spacing w:before="160" w:after="40"/>
+      </w:pPr>
+      <w:r>
+        <w:rPr>
+          <w:b/>
+          <w:sz w:val="20"/>
+        </w:rPr>
+        <w:t>R11 › Sposoby zapobiegania i minimalizacji skutków</w:t>
+      </w:r>
+      <w:r>
+        <w:rPr>
+          <w:color w:val="666666"/>
+          <w:sz w:val="17"/>
+        </w:rPr>
+        <w:t xml:space="preserve"> [1167 znaków]</w:t>
+      </w:r>
+    </w:p>
+    <w:p>
+      <w:pPr>
+        <w:spacing w:after="60"/>
+      </w:pPr>
+      <w:r>
+        <w:rPr>
+          <w:b w:val="0"/>
+        </w:rPr>
+        <w:t>Plan zastępczy składa się z trzech elementów. Pierwszym jest umowa partnerska z drugim przewoźnikiem spośród dotychczasowych dostawców usług transportowych Everest11, przygotowywana warunkowo przed M13 (start kampanii) i uruchamiana, gdy dostępność floty spadnie poniżej 3 pojazdów lub 2 tras. Drugim jest metodyka anotacji i taksonomia niezależne od źródła pojazdów, więc zmiana floty nie wymaga powtórzenia anotacji. Trzecim są gwarancje dostępu do danych o ładunkach, tras i dokumentacji inspekcyjnej w umowach. Niezależność walidacji nie zależy od partnera testowego: zabezpiecza ją ścieżka audytu z zadania Z9 (ewaluator bez powiązań z Natanek Logistics, log niemodyfikowalny, zamrożony skrypt, protokół podpisują kierownicy), a Natanek Logistics nie ma dostępu do zbioru, modeli ani wyników walidacji. Dywersyfikacja floty zmniejsza zależność od jednego partnera. Skutki ograniczamy tak: przesuwamy kampanię w ramach rezerwy czasowej zadania Z2 (przed M18) i wydłużamy Fazę A zadania Z9. Jeżeli do M22 nie ma floty zastępczej, ograniczamy walidację w zadaniu Z9 do liczby kursów osiągalnej na dostępnych pojazdach i aktualizujemy KM-Z9 w trybie zmiany projektu.</w:t>
+      </w:r>
+    </w:p>
+    <w:p>
+      <w:pPr>
+        <w:pStyle w:val="ListBullet"/>
+      </w:pPr>
+      <w:r>
+        <w:rPr>
+          <w:b/>
+        </w:rPr>
+        <w:t>Co się zmieniło względem pliku LSI:</w:t>
+      </w:r>
+      <w:r>
+        <w:rPr>
+          <w:b w:val="0"/>
+        </w:rPr>
+        <w:t xml:space="preserve"> dopisane powiązanie i skala zależności (D47), usunięte zdanie „spośród aktywnych kontrahentów Everest11” (D48: jedyny aktywny odbiorca to Amazon), usunięte nieprawdziwe zdanie, że żaden podmiot nie jest jednocześnie partnerem testowym i odbiorcą, dodane odesłanie do R12 i do ścieżki audytu.</w:t>
+      </w:r>
+    </w:p>
+    <w:p>
+      <w:pPr>
+        <w:pStyle w:val="ListBullet"/>
+      </w:pPr>
+      <w:r>
+        <w:rPr>
+          <w:b/>
+        </w:rPr>
+        <w:t>Do potwierdzenia:</w:t>
+      </w:r>
+      <w:r>
+        <w:rPr>
+          <w:b w:val="0"/>
+        </w:rPr>
+        <w:t xml:space="preserve"> wcześniejsza wersja z pliku Opisy_zadan miała czwarty element planu zastępczego: pojazdy w najmie Everest11 (5 zestawów, wzrost do 20) jako rezerwa do montażu. Plik LSI go pomija, a w 6.2 flota testowa jest opisana jako udostępniona przez Natanek Logistics. Jeżeli aneks do umów najmu (T02) powstaje, dopisać ten element po „Trzecim”; jeżeli nie, zostawić trzy.</w:t>
+      </w:r>
+    </w:p>
+    <w:p>
+      <w:pPr>
+        <w:pStyle w:val="Heading2"/>
+      </w:pPr>
+      <w:r>
+        <w:t>8.3 R12: teksty ze „Zmiany” 3.1 i 3.2 plus po jednym zdaniu z pliku LSI</w:t>
+      </w:r>
+    </w:p>
+    <w:p>
+      <w:pPr>
+        <w:pStyle w:val="ListBullet"/>
+      </w:pPr>
+      <w:r>
+        <w:rPr>
+          <w:b/>
+        </w:rPr>
+        <w:t>Opis ryzyka:</w:t>
+      </w:r>
+      <w:r>
+        <w:rPr>
+          <w:b w:val="0"/>
+        </w:rPr>
+        <w:t xml:space="preserve"> wkleić tekst z pozycji 3.1 (1183 znaków) i dopisać na końcu: „Dwaj pozostali operatorzy z listami intencyjnymi (30 naczep) nie są powiązani z Inwestorem ani z Everest11, co ogranicza skalę zależności po stronie przychodów.” Razem ok. 1 350 znaków.</w:t>
+      </w:r>
+    </w:p>
+    <w:p>
+      <w:pPr>
+        <w:pStyle w:val="ListBullet"/>
+      </w:pPr>
+      <w:r>
+        <w:rPr>
+          <w:b/>
+        </w:rPr>
+        <w:t>Sposoby zapobiegania:</w:t>
+      </w:r>
+      <w:r>
+        <w:rPr>
+          <w:b w:val="0"/>
+        </w:rPr>
+        <w:t xml:space="preserve"> wkleić tekst z pozycji 3.2 (1332 znaków) i dopisać na końcu: „CargoDT sprzedajemy Natanek Logistics według tego samego cennika, co pozostałym klientom, bez rabatów indywidualnych.” Razem ok. 1 450 znaków.</w:t>
+      </w:r>
+    </w:p>
+    <w:p>
+      <w:pPr>
+        <w:pStyle w:val="ListBullet"/>
+      </w:pPr>
+      <w:r>
+        <w:rPr>
+          <w:b/>
+        </w:rPr>
+        <w:t>Powód:</w:t>
+      </w:r>
+      <w:r>
+        <w:rPr>
+          <w:b w:val="0"/>
+        </w:rPr>
+        <w:t xml:space="preserve"> teksty z pozycji 3.1 i 3.2 mają ujawnioną skalę (ok. 13,4 mln zł w 2025 r. i ok. 8,4 mln zł w I półroczu 2026 r.), kwartalny raport udziału, alternatywnych dostawców i niezależność walidacji przez ścieżkę audytu. Plik LSI tego nie ma, ale ma dwa dobre zdania (pozostali operatorzy niepowiązani, jeden cennik), których nie ma w „Zmiany”. W wersji LSI zdanie „formalnie ustalamy, czy powiązane” zostaje, bo jest w 3.2, i nie przeczy 2.3, jeżeli w 2.3 napiszemy „powiązany z przyszłym Inwestorem” (bez słowa „osobowo”, które sugeruje przesądzone powiązanie w rozumieniu CIT).</w:t>
+      </w:r>
+    </w:p>
+    <w:p>
+      <w:pPr>
+        <w:pStyle w:val="Heading2"/>
+      </w:pPr>
+      <w:r>
+        <w:t>8.4 Budżet Z10 i Z11: pkt 3.2.3 i 3.2.5</w:t>
+      </w:r>
+    </w:p>
+    <w:p>
+      <w:r>
+        <w:rPr>
+          <w:b w:val="0"/>
+        </w:rPr>
+        <w:t xml:space="preserve">Pozycje są gotowe w pliku Sekcja_3.2_internacjonalizacja_Z10_Z11.docx (część 4 i 5) i </w:t>
+      </w:r>
+      <w:r>
+        <w:rPr>
+          <w:b/>
+        </w:rPr>
+        <w:t>zastępują wszystkie dotychczasowe pozycje internacjonalizacji w wersji C</w:t>
+      </w:r>
+      <w:r>
+        <w:rPr>
+          <w:b w:val="0"/>
+        </w:rPr>
+        <w:t xml:space="preserve"> (tam są m.in. pakiet kongresu 24 000 zł, delegacje 7 586 zł liczone jako koszty rzeczywiste oraz materiały promocyjne 6 000 zł jako doradztwo art. 18, a brak odrębnej pozycji na misję, czyli dokładnie to, co krytykują K3-24, K3-63 do K3-65). Docelowo:</w:t>
+      </w:r>
+    </w:p>
+    <w:tbl>
+      <w:tblPr>
+        <w:tblStyle w:val="TableGrid"/>
+        <w:tblW w:type="auto" w:w="0"/>
+        <w:tblLook w:firstColumn="1" w:firstRow="1" w:lastColumn="0" w:lastRow="0" w:noHBand="0" w:noVBand="1" w:val="04A0"/>
+      </w:tblPr>
+      <w:tblGrid>
+        <w:gridCol w:w="1928"/>
+        <w:gridCol w:w="1928"/>
+        <w:gridCol w:w="1928"/>
+        <w:gridCol w:w="1928"/>
+        <w:gridCol w:w="1928"/>
+      </w:tblGrid>
+      <w:tr>
+        <w:tc>
+          <w:tcPr>
+            <w:tcW w:type="dxa" w:w="680"/>
+          </w:tcPr>
+          <w:p>
+            <w:r/>
+            <w:r>
+              <w:rPr>
+                <w:b/>
+                <w:sz w:val="18"/>
+              </w:rPr>
+              <w:t>Poz.</w:t>
+            </w:r>
+          </w:p>
+        </w:tc>
+        <w:tc>
+          <w:tcPr>
+            <w:tcW w:type="dxa" w:w="3969"/>
+          </w:tcPr>
+          <w:p>
+            <w:r/>
+            <w:r>
+              <w:rPr>
+                <w:b/>
+                <w:sz w:val="18"/>
+              </w:rPr>
+              <w:t>Pozycja</w:t>
+            </w:r>
+          </w:p>
+        </w:tc>
+        <w:tc>
+          <w:tcPr>
+            <w:tcW w:type="dxa" w:w="794"/>
+          </w:tcPr>
+          <w:p>
+            <w:r/>
+            <w:r>
+              <w:rPr>
+                <w:b/>
+                <w:sz w:val="18"/>
+              </w:rPr>
+              <w:t>Gdzie</w:t>
+            </w:r>
+          </w:p>
+        </w:tc>
+        <w:tc>
+          <w:tcPr>
+            <w:tcW w:type="dxa" w:w="1928"/>
+          </w:tcPr>
+          <w:p>
+            <w:r/>
+            <w:r>
+              <w:rPr>
+                <w:b/>
+                <w:sz w:val="18"/>
+              </w:rPr>
+              <w:t>Kwalifikowalne netto, zł</w:t>
+            </w:r>
+          </w:p>
+        </w:tc>
+        <w:tc>
+          <w:tcPr>
+            <w:tcW w:type="dxa" w:w="2381"/>
+          </w:tcPr>
+          <w:p>
+            <w:r/>
+            <w:r>
+              <w:rPr>
+                <w:b/>
+                <w:sz w:val="18"/>
+              </w:rPr>
+              <w:t>Pomoc i kategoria</w:t>
+            </w:r>
+          </w:p>
+        </w:tc>
+      </w:tr>
+      <w:tr>
+        <w:tc>
+          <w:tcPr>
+            <w:tcW w:type="dxa" w:w="680"/>
+          </w:tcPr>
+          <w:p>
+            <w:r/>
+            <w:r>
+              <w:rPr>
+                <w:b w:val="0"/>
+                <w:sz w:val="18"/>
+              </w:rPr>
+              <w:t>10-1</w:t>
+            </w:r>
+          </w:p>
+        </w:tc>
+        <w:tc>
+          <w:tcPr>
+            <w:tcW w:type="dxa" w:w="3969"/>
+          </w:tcPr>
+          <w:p>
+            <w:r/>
+            <w:r>
+              <w:rPr>
+                <w:b w:val="0"/>
+                <w:sz w:val="18"/>
+              </w:rPr>
+              <w:t>Opłata za powierzchnię stoiska i opłata podstawowa, TRANSLOG 2028 (9 m2, 2 delegatów)</w:t>
+            </w:r>
+          </w:p>
+        </w:tc>
+        <w:tc>
+          <w:tcPr>
+            <w:tcW w:type="dxa" w:w="794"/>
+          </w:tcPr>
+          <w:p>
+            <w:r/>
+            <w:r>
+              <w:rPr>
+                <w:b w:val="0"/>
+                <w:sz w:val="18"/>
+              </w:rPr>
+              <w:t>3.2.3</w:t>
+            </w:r>
+          </w:p>
+        </w:tc>
+        <w:tc>
+          <w:tcPr>
+            <w:tcW w:type="dxa" w:w="1928"/>
+          </w:tcPr>
+          <w:p>
+            <w:r/>
+            <w:r>
+              <w:rPr>
+                <w:b w:val="0"/>
+                <w:sz w:val="18"/>
+              </w:rPr>
+              <w:t>13 735,00</w:t>
+            </w:r>
+          </w:p>
+        </w:tc>
+        <w:tc>
+          <w:tcPr>
+            <w:tcW w:type="dxa" w:w="2381"/>
+          </w:tcPr>
+          <w:p>
+            <w:r/>
+            <w:r>
+              <w:rPr>
+                <w:b w:val="0"/>
+                <w:sz w:val="18"/>
+              </w:rPr>
+              <w:t>de minimis, 5.3.8</w:t>
+            </w:r>
+          </w:p>
+        </w:tc>
+      </w:tr>
+      <w:tr>
+        <w:tc>
+          <w:tcPr>
+            <w:tcW w:type="dxa" w:w="680"/>
+          </w:tcPr>
+          <w:p>
+            <w:r/>
+            <w:r>
+              <w:rPr>
+                <w:b w:val="0"/>
+                <w:sz w:val="18"/>
+              </w:rPr>
+              <w:t>10-2</w:t>
+            </w:r>
+          </w:p>
+        </w:tc>
+        <w:tc>
+          <w:tcPr>
+            <w:tcW w:type="dxa" w:w="3969"/>
+          </w:tcPr>
+          <w:p>
+            <w:r/>
+            <w:r>
+              <w:rPr>
+                <w:b w:val="0"/>
+                <w:sz w:val="18"/>
+              </w:rPr>
+              <w:t>Energia, zabudowa i meble stoiska</w:t>
+            </w:r>
+          </w:p>
+        </w:tc>
+        <w:tc>
+          <w:tcPr>
+            <w:tcW w:type="dxa" w:w="794"/>
+          </w:tcPr>
+          <w:p>
+            <w:r/>
+            <w:r>
+              <w:rPr>
+                <w:b w:val="0"/>
+                <w:sz w:val="18"/>
+              </w:rPr>
+              <w:t>3.2.3</w:t>
+            </w:r>
+          </w:p>
+        </w:tc>
+        <w:tc>
+          <w:tcPr>
+            <w:tcW w:type="dxa" w:w="1928"/>
+          </w:tcPr>
+          <w:p>
+            <w:r/>
+            <w:r>
+              <w:rPr>
+                <w:b w:val="0"/>
+                <w:sz w:val="18"/>
+              </w:rPr>
+              <w:t>10 184,00</w:t>
+            </w:r>
+          </w:p>
+        </w:tc>
+        <w:tc>
+          <w:tcPr>
+            <w:tcW w:type="dxa" w:w="2381"/>
+          </w:tcPr>
+          <w:p>
+            <w:r/>
+            <w:r>
+              <w:rPr>
+                <w:b w:val="0"/>
+                <w:sz w:val="18"/>
+              </w:rPr>
+              <w:t>art. 19 GBER, 5.3.2</w:t>
+            </w:r>
+          </w:p>
+        </w:tc>
+      </w:tr>
+      <w:tr>
+        <w:tc>
+          <w:tcPr>
+            <w:tcW w:type="dxa" w:w="680"/>
+          </w:tcPr>
+          <w:p>
+            <w:r/>
+            <w:r>
+              <w:rPr>
+                <w:b w:val="0"/>
+                <w:sz w:val="18"/>
+              </w:rPr>
+              <w:t>10-3</w:t>
+            </w:r>
+          </w:p>
+        </w:tc>
+        <w:tc>
+          <w:tcPr>
+            <w:tcW w:type="dxa" w:w="3969"/>
+          </w:tcPr>
+          <w:p>
+            <w:r/>
+            <w:r>
+              <w:rPr>
+                <w:b w:val="0"/>
+                <w:sz w:val="18"/>
+              </w:rPr>
+              <w:t>Zabudowa wizualna stoiska (projekt i baner z wizualizacją CargoDT)</w:t>
+            </w:r>
+          </w:p>
+        </w:tc>
+        <w:tc>
+          <w:tcPr>
+            <w:tcW w:type="dxa" w:w="794"/>
+          </w:tcPr>
+          <w:p>
+            <w:r/>
+            <w:r>
+              <w:rPr>
+                <w:b w:val="0"/>
+                <w:sz w:val="18"/>
+              </w:rPr>
+              <w:t>3.2.3</w:t>
+            </w:r>
+          </w:p>
+        </w:tc>
+        <w:tc>
+          <w:tcPr>
+            <w:tcW w:type="dxa" w:w="1928"/>
+          </w:tcPr>
+          <w:p>
+            <w:r/>
+            <w:r>
+              <w:rPr>
+                <w:b w:val="0"/>
+                <w:sz w:val="18"/>
+              </w:rPr>
+              <w:t>1 200,00</w:t>
+            </w:r>
+          </w:p>
+        </w:tc>
+        <w:tc>
+          <w:tcPr>
+            <w:tcW w:type="dxa" w:w="2381"/>
+          </w:tcPr>
+          <w:p>
+            <w:r/>
+            <w:r>
+              <w:rPr>
+                <w:b w:val="0"/>
+                <w:sz w:val="18"/>
+              </w:rPr>
+              <w:t>art. 19 GBER, 5.3.1</w:t>
+            </w:r>
+          </w:p>
+        </w:tc>
+      </w:tr>
+      <w:tr>
+        <w:tc>
+          <w:tcPr>
+            <w:tcW w:type="dxa" w:w="680"/>
+          </w:tcPr>
+          <w:p>
+            <w:r/>
+            <w:r>
+              <w:rPr>
+                <w:b w:val="0"/>
+                <w:sz w:val="18"/>
+              </w:rPr>
+              <w:t>10-6</w:t>
+            </w:r>
+          </w:p>
+        </w:tc>
+        <w:tc>
+          <w:tcPr>
+            <w:tcW w:type="dxa" w:w="3969"/>
+          </w:tcPr>
+          <w:p>
+            <w:r/>
+            <w:r>
+              <w:rPr>
+                <w:b w:val="0"/>
+                <w:sz w:val="18"/>
+              </w:rPr>
+              <w:t>Usługi doradcze: rynki CEE, model partnerstw i licencji API (14 dni x 8 h x 125 zł)</w:t>
+            </w:r>
+          </w:p>
+        </w:tc>
+        <w:tc>
+          <w:tcPr>
+            <w:tcW w:type="dxa" w:w="794"/>
+          </w:tcPr>
+          <w:p>
+            <w:r/>
+            <w:r>
+              <w:rPr>
+                <w:b w:val="0"/>
+                <w:sz w:val="18"/>
+              </w:rPr>
+              <w:t>3.2.3</w:t>
+            </w:r>
+          </w:p>
+        </w:tc>
+        <w:tc>
+          <w:tcPr>
+            <w:tcW w:type="dxa" w:w="1928"/>
+          </w:tcPr>
+          <w:p>
+            <w:r/>
+            <w:r>
+              <w:rPr>
+                <w:b w:val="0"/>
+                <w:sz w:val="18"/>
+              </w:rPr>
+              <w:t>14 000,00</w:t>
+            </w:r>
+          </w:p>
+        </w:tc>
+        <w:tc>
+          <w:tcPr>
+            <w:tcW w:type="dxa" w:w="2381"/>
+          </w:tcPr>
+          <w:p>
+            <w:r/>
+            <w:r>
+              <w:rPr>
+                <w:b w:val="0"/>
+                <w:sz w:val="18"/>
+              </w:rPr>
+              <w:t>art. 18 GBER, 5.3.7</w:t>
+            </w:r>
+          </w:p>
+        </w:tc>
+      </w:tr>
+      <w:tr>
+        <w:tc>
+          <w:tcPr>
+            <w:tcW w:type="dxa" w:w="680"/>
+          </w:tcPr>
+          <w:p>
+            <w:r/>
+            <w:r>
+              <w:rPr>
+                <w:b w:val="0"/>
+                <w:sz w:val="18"/>
+              </w:rPr>
+              <w:t>11-1</w:t>
+            </w:r>
+          </w:p>
+        </w:tc>
+        <w:tc>
+          <w:tcPr>
+            <w:tcW w:type="dxa" w:w="3969"/>
+          </w:tcPr>
+          <w:p>
+            <w:r/>
+            <w:r>
+              <w:rPr>
+                <w:b w:val="0"/>
+                <w:sz w:val="18"/>
+              </w:rPr>
+              <w:t>Wstępne orzeczenie rzecznika o zdolności patentowej</w:t>
+            </w:r>
+          </w:p>
+        </w:tc>
+        <w:tc>
+          <w:tcPr>
+            <w:tcW w:type="dxa" w:w="794"/>
+          </w:tcPr>
+          <w:p>
+            <w:r/>
+            <w:r>
+              <w:rPr>
+                <w:b w:val="0"/>
+                <w:sz w:val="18"/>
+              </w:rPr>
+              <w:t>3.2.3</w:t>
+            </w:r>
+          </w:p>
+        </w:tc>
+        <w:tc>
+          <w:tcPr>
+            <w:tcW w:type="dxa" w:w="1928"/>
+          </w:tcPr>
+          <w:p>
+            <w:r/>
+            <w:r>
+              <w:rPr>
+                <w:b w:val="0"/>
+                <w:sz w:val="18"/>
+              </w:rPr>
+              <w:t>8 000,00</w:t>
+            </w:r>
+          </w:p>
+        </w:tc>
+        <w:tc>
+          <w:tcPr>
+            <w:tcW w:type="dxa" w:w="2381"/>
+          </w:tcPr>
+          <w:p>
+            <w:r/>
+            <w:r>
+              <w:rPr>
+                <w:b w:val="0"/>
+                <w:sz w:val="18"/>
+              </w:rPr>
+              <w:t>de minimis, 5.3.11</w:t>
+            </w:r>
+          </w:p>
+        </w:tc>
+      </w:tr>
+      <w:tr>
+        <w:tc>
+          <w:tcPr>
+            <w:tcW w:type="dxa" w:w="680"/>
+          </w:tcPr>
+          <w:p>
+            <w:r/>
+            <w:r>
+              <w:rPr>
+                <w:b w:val="0"/>
+                <w:sz w:val="18"/>
+              </w:rPr>
+              <w:t>11-2</w:t>
+            </w:r>
+          </w:p>
+        </w:tc>
+        <w:tc>
+          <w:tcPr>
+            <w:tcW w:type="dxa" w:w="3969"/>
+          </w:tcPr>
+          <w:p>
+            <w:r/>
+            <w:r>
+              <w:rPr>
+                <w:b w:val="0"/>
+                <w:sz w:val="18"/>
+              </w:rPr>
+              <w:t>Rzecznik: dokumentacja zgłoszeniowa, zgłoszenie do EPO, tłumaczenia</w:t>
+            </w:r>
+          </w:p>
+        </w:tc>
+        <w:tc>
+          <w:tcPr>
+            <w:tcW w:type="dxa" w:w="794"/>
+          </w:tcPr>
+          <w:p>
+            <w:r/>
+            <w:r>
+              <w:rPr>
+                <w:b w:val="0"/>
+                <w:sz w:val="18"/>
+              </w:rPr>
+              <w:t>3.2.3</w:t>
+            </w:r>
+          </w:p>
+        </w:tc>
+        <w:tc>
+          <w:tcPr>
+            <w:tcW w:type="dxa" w:w="1928"/>
+          </w:tcPr>
+          <w:p>
+            <w:r/>
+            <w:r>
+              <w:rPr>
+                <w:b w:val="0"/>
+                <w:sz w:val="18"/>
+              </w:rPr>
+              <w:t>15 500,00</w:t>
+            </w:r>
+          </w:p>
+        </w:tc>
+        <w:tc>
+          <w:tcPr>
+            <w:tcW w:type="dxa" w:w="2381"/>
+          </w:tcPr>
+          <w:p>
+            <w:r/>
+            <w:r>
+              <w:rPr>
+                <w:b w:val="0"/>
+                <w:sz w:val="18"/>
+              </w:rPr>
+              <w:t>art. 28 GBER</w:t>
+            </w:r>
+          </w:p>
+        </w:tc>
+      </w:tr>
+      <w:tr>
+        <w:tc>
+          <w:tcPr>
+            <w:tcW w:type="dxa" w:w="680"/>
+          </w:tcPr>
+          <w:p>
+            <w:r/>
+            <w:r>
+              <w:rPr>
+                <w:b w:val="0"/>
+                <w:sz w:val="18"/>
+              </w:rPr>
+              <w:t>11-3</w:t>
+            </w:r>
+          </w:p>
+        </w:tc>
+        <w:tc>
+          <w:tcPr>
+            <w:tcW w:type="dxa" w:w="3969"/>
+          </w:tcPr>
+          <w:p>
+            <w:r/>
+            <w:r>
+              <w:rPr>
+                <w:b w:val="0"/>
+                <w:sz w:val="18"/>
+              </w:rPr>
+              <w:t>Opłaty urzędowe EPO (bez VAT)</w:t>
+            </w:r>
+          </w:p>
+        </w:tc>
+        <w:tc>
+          <w:tcPr>
+            <w:tcW w:type="dxa" w:w="794"/>
+          </w:tcPr>
+          <w:p>
+            <w:r/>
+            <w:r>
+              <w:rPr>
+                <w:b w:val="0"/>
+                <w:sz w:val="18"/>
+              </w:rPr>
+              <w:t>3.2.3</w:t>
+            </w:r>
+          </w:p>
+        </w:tc>
+        <w:tc>
+          <w:tcPr>
+            <w:tcW w:type="dxa" w:w="1928"/>
+          </w:tcPr>
+          <w:p>
+            <w:r/>
+            <w:r>
+              <w:rPr>
+                <w:b w:val="0"/>
+                <w:sz w:val="18"/>
+              </w:rPr>
+              <w:t>7 785,00</w:t>
+            </w:r>
+          </w:p>
+        </w:tc>
+        <w:tc>
+          <w:tcPr>
+            <w:tcW w:type="dxa" w:w="2381"/>
+          </w:tcPr>
+          <w:p>
+            <w:r/>
+            <w:r>
+              <w:rPr>
+                <w:b w:val="0"/>
+                <w:sz w:val="18"/>
+              </w:rPr>
+              <w:t>opłaty urzędowe</w:t>
+            </w:r>
+          </w:p>
+        </w:tc>
+      </w:tr>
+      <w:tr>
+        <w:tc>
+          <w:tcPr>
+            <w:tcW w:type="dxa" w:w="680"/>
+          </w:tcPr>
+          <w:p>
+            <w:r/>
+            <w:r>
+              <w:rPr>
+                <w:b w:val="0"/>
+                <w:sz w:val="18"/>
+              </w:rPr>
+              <w:t>10-4</w:t>
+            </w:r>
+          </w:p>
+        </w:tc>
+        <w:tc>
+          <w:tcPr>
+            <w:tcW w:type="dxa" w:w="3969"/>
+          </w:tcPr>
+          <w:p>
+            <w:r/>
+            <w:r>
+              <w:rPr>
+                <w:b w:val="0"/>
+                <w:sz w:val="18"/>
+              </w:rPr>
+              <w:t>Wyjazd na kongres, stawka 5 489 zł x 2 osoby</w:t>
+            </w:r>
+          </w:p>
+        </w:tc>
+        <w:tc>
+          <w:tcPr>
+            <w:tcW w:type="dxa" w:w="794"/>
+          </w:tcPr>
+          <w:p>
+            <w:r/>
+            <w:r>
+              <w:rPr>
+                <w:b w:val="0"/>
+                <w:sz w:val="18"/>
+              </w:rPr>
+              <w:t>3.2.5</w:t>
+            </w:r>
+          </w:p>
+        </w:tc>
+        <w:tc>
+          <w:tcPr>
+            <w:tcW w:type="dxa" w:w="1928"/>
+          </w:tcPr>
+          <w:p>
+            <w:r/>
+            <w:r>
+              <w:rPr>
+                <w:b w:val="0"/>
+                <w:sz w:val="18"/>
+              </w:rPr>
+              <w:t>10 978,00</w:t>
+            </w:r>
+          </w:p>
+        </w:tc>
+        <w:tc>
+          <w:tcPr>
+            <w:tcW w:type="dxa" w:w="2381"/>
+          </w:tcPr>
+          <w:p>
+            <w:r/>
+            <w:r>
+              <w:rPr>
+                <w:b w:val="0"/>
+                <w:sz w:val="18"/>
+              </w:rPr>
+              <w:t>art. 19 GBER, 5.3.3</w:t>
+            </w:r>
+          </w:p>
+        </w:tc>
+      </w:tr>
+      <w:tr>
+        <w:tc>
+          <w:tcPr>
+            <w:tcW w:type="dxa" w:w="680"/>
+          </w:tcPr>
+          <w:p>
+            <w:r/>
+            <w:r>
+              <w:rPr>
+                <w:b w:val="0"/>
+                <w:sz w:val="18"/>
+              </w:rPr>
+              <w:t>10-5</w:t>
+            </w:r>
+          </w:p>
+        </w:tc>
+        <w:tc>
+          <w:tcPr>
+            <w:tcW w:type="dxa" w:w="3969"/>
+          </w:tcPr>
+          <w:p>
+            <w:r/>
+            <w:r>
+              <w:rPr>
+                <w:b w:val="0"/>
+                <w:sz w:val="18"/>
+              </w:rPr>
+              <w:t>Misja gospodarcza do Czech 2029, stawka 5 489 zł x 1 osoba</w:t>
+            </w:r>
+          </w:p>
+        </w:tc>
+        <w:tc>
+          <w:tcPr>
+            <w:tcW w:type="dxa" w:w="794"/>
+          </w:tcPr>
+          <w:p>
+            <w:r/>
+            <w:r>
+              <w:rPr>
+                <w:b w:val="0"/>
+                <w:sz w:val="18"/>
+              </w:rPr>
+              <w:t>3.2.5</w:t>
+            </w:r>
+          </w:p>
+        </w:tc>
+        <w:tc>
+          <w:tcPr>
+            <w:tcW w:type="dxa" w:w="1928"/>
+          </w:tcPr>
+          <w:p>
+            <w:r/>
+            <w:r>
+              <w:rPr>
+                <w:b w:val="0"/>
+                <w:sz w:val="18"/>
+              </w:rPr>
+              <w:t>5 489,00</w:t>
+            </w:r>
+          </w:p>
+        </w:tc>
+        <w:tc>
+          <w:tcPr>
+            <w:tcW w:type="dxa" w:w="2381"/>
+          </w:tcPr>
+          <w:p>
+            <w:r/>
+            <w:r>
+              <w:rPr>
+                <w:b w:val="0"/>
+                <w:sz w:val="18"/>
+              </w:rPr>
+              <w:t>de minimis, 5.3.4</w:t>
+            </w:r>
+          </w:p>
+        </w:tc>
+      </w:tr>
+      <w:tr>
+        <w:tc>
+          <w:tcPr>
+            <w:tcW w:type="dxa" w:w="680"/>
+          </w:tcPr>
+          <w:p>
+            <w:r/>
+          </w:p>
+        </w:tc>
+        <w:tc>
+          <w:tcPr>
+            <w:tcW w:type="dxa" w:w="3969"/>
+          </w:tcPr>
+          <w:p>
+            <w:r/>
+            <w:r>
+              <w:rPr>
+                <w:b w:val="0"/>
+                <w:sz w:val="18"/>
+              </w:rPr>
+              <w:t>RAZEM kwalifikowalne / dofinansowanie 50%</w:t>
+            </w:r>
+          </w:p>
+        </w:tc>
+        <w:tc>
+          <w:tcPr>
+            <w:tcW w:type="dxa" w:w="794"/>
+          </w:tcPr>
+          <w:p>
+            <w:r/>
+          </w:p>
+        </w:tc>
+        <w:tc>
+          <w:tcPr>
+            <w:tcW w:type="dxa" w:w="1928"/>
+          </w:tcPr>
+          <w:p>
+            <w:r/>
+            <w:r>
+              <w:rPr>
+                <w:b w:val="0"/>
+                <w:sz w:val="18"/>
+              </w:rPr>
+              <w:t>86 871,00 / 43 435,50</w:t>
+            </w:r>
+          </w:p>
+        </w:tc>
+        <w:tc>
+          <w:tcPr>
+            <w:tcW w:type="dxa" w:w="2381"/>
+          </w:tcPr>
+          <w:p>
+            <w:r/>
+            <w:r>
+              <w:rPr>
+                <w:b w:val="0"/>
+                <w:sz w:val="18"/>
+              </w:rPr>
+              <w:t>bez zmiany względem obecnego wniosku</w:t>
+            </w:r>
+          </w:p>
+        </w:tc>
+      </w:tr>
+    </w:tbl>
+    <w:p/>
+    <w:p>
+      <w:r>
+        <w:rPr>
+          <w:b w:val="0"/>
+        </w:rPr>
+        <w:t>Sprawdziłam sumy: 70 404 zł w 3.2.3 plus 16 467 zł w 3.2.5 daje 86 871 zł, a wydatki ogółem 101 273,37 zł wynikają z VAT 23% na pozycjach 10-1, 10-2, 10-3, 10-6, 11-1 i 11-2 (62 619 zł x 1,23 = 77 021,37 zł) plus pozycje bez VAT (24 252 zł). Dofinansowanie się nie zmienia.</w:t>
+      </w:r>
+    </w:p>
+    <w:p>
+      <w:pPr>
+        <w:pStyle w:val="Heading2"/>
+      </w:pPr>
+      <w:r>
+        <w:t>8.5 Co poprawić w gotowym pliku Sekcja_3.2 i w LSI przed wklejeniem</w:t>
+      </w:r>
+    </w:p>
+    <w:p>
+      <w:pPr>
+        <w:pStyle w:val="ListBullet"/>
+      </w:pPr>
+      <w:r>
+        <w:rPr>
+          <w:b/>
+        </w:rPr>
+        <w:t>Data eFTI:</w:t>
+      </w:r>
+      <w:r>
+        <w:rPr>
+          <w:b w:val="0"/>
+        </w:rPr>
+        <w:t xml:space="preserve"> w pliku Sekcja_3.2 (3.2.1, „Po drugie…”) jest „Od 21.08.2025”. Poprawna data to 9 lipca 2027 r., a plik LSI ma ją już dobrze, więc 3.2.1 wklejać z pliku LSI, nie z Sekcja_3.2.</w:t>
+      </w:r>
+    </w:p>
+    <w:p>
+      <w:pPr>
+        <w:pStyle w:val="ListBullet"/>
+      </w:pPr>
+      <w:r>
+        <w:rPr>
+          <w:b/>
+        </w:rPr>
+        <w:t>Pozycja 10-4:</w:t>
+      </w:r>
+      <w:r>
+        <w:rPr>
+          <w:b w:val="0"/>
+        </w:rPr>
+        <w:t xml:space="preserve"> uzasadnienie podaje „Przewodnik 5.3.4”, a dla kongresu (art. 19 GBER) powinno być 5.3.3, tak jak w opisie Z10. Pozycja 10-5 (misja, de minimis) zostaje z 5.3.4.</w:t>
+      </w:r>
+    </w:p>
+    <w:p>
+      <w:pPr>
+        <w:pStyle w:val="ListBullet"/>
+      </w:pPr>
+      <w:r>
+        <w:rPr>
+          <w:b/>
+        </w:rPr>
+        <w:t>Nazwa wydarzenia misji w tabeli 3.2.1:</w:t>
+      </w:r>
+      <w:r>
+        <w:rPr>
+          <w:b w:val="0"/>
+        </w:rPr>
+        <w:t xml:space="preserve"> w wersji C „misja gospodarcza do CEE (np. Czechy/Rumunia)”, a w tekście i budżecie misja do Czech. Wpisać „misja gospodarcza do Czech”.</w:t>
+      </w:r>
+    </w:p>
+    <w:p>
+      <w:pPr>
+        <w:pStyle w:val="ListBullet"/>
+      </w:pPr>
+      <w:r>
+        <w:rPr>
+          <w:b/>
+        </w:rPr>
+        <w:t>Pole 8.2 (K14-01):</w:t>
+      </w:r>
+      <w:r>
+        <w:rPr>
+          <w:b w:val="0"/>
+        </w:rPr>
+        <w:t xml:space="preserve"> wkleić z Sekcja_3.2 część 6 (0 zł, rok 2030, decyzja D40), ale zdanie „pierwsze przychody poza RP wynikają z modelu od 2032-2033” zamienić na „przychodów poza RP nie zakładamy w prognozie; licencje API dla dostawców TMS w CEE byłyby uzupełnieniem poza prognozą”, bo model nie ma sprzedaży zagranicznej (patrz 7.3, poz. 4 i 11).</w:t>
+      </w:r>
+    </w:p>
+    <w:p>
+      <w:pPr>
+        <w:pStyle w:val="ListBullet"/>
+      </w:pPr>
+      <w:r>
+        <w:rPr>
+          <w:b/>
+        </w:rPr>
+        <w:t>Delegat na kongres:</w:t>
+      </w:r>
+      <w:r>
+        <w:rPr>
+          <w:b w:val="0"/>
+        </w:rPr>
+        <w:t xml:space="preserve"> opis Z10 mówi, że pojadą „kierownik zarządzający” i specjalista TSL i że „obie osoby są zatrudnione w Everest11”. Kierownik zarządzający pracuje na umowie zlecenia i jego wynagrodzenie jest w kosztach pośrednich. Sprawdzić w Przewodniku (5.3.3), czy stawka jednostkowa wymaga zatrudnienia na etacie i czy wyjazd osoby z kosztów pośrednich nie dubluje ryczałtu. Jeżeli tak, drugim delegatem powinien być pracownik Everest11 (np. IoT Specialist), a opis Z10 trzeba przeredagować.</w:t>
+      </w:r>
+    </w:p>
+    <w:p>
+      <w:pPr>
+        <w:pStyle w:val="ListBullet"/>
+      </w:pPr>
+      <w:r>
+        <w:rPr>
+          <w:b/>
+        </w:rPr>
+        <w:t>Pozycje 11-1 i 11-2:</w:t>
+      </w:r>
+      <w:r>
+        <w:rPr>
+          <w:b w:val="0"/>
+        </w:rPr>
+        <w:t xml:space="preserve"> nadal jedna oferta (JWP z 11.06.2026). Instrukcja wymaga liczby i nazw dostawców, do których wysłano zapytanie, i ich odpowiedzi (T36). Do czasu uzupełnienia metoda szacowania jest niepełna, a nie możemy jej uzupełnić bez dwóch dodatkowych ofert albo publicznych cenników.</w:t>
+      </w:r>
+    </w:p>
     <w:sectPr>
       <w:pgSz w:w="11906" w:h="16838"/>
       <w:pgMar w:top="1134" w:right="1134" w:bottom="1134" w:left="1134" w:header="720" w:footer="720" w:gutter="0"/>

</xml_diff>

<commit_message>
D59: baza kontrahentow zostaje (bez 'aktywnych'); poprawka czesci 7 i 1 w Zmiany, rejestr
Co-Authored-By: Claude Sonnet 5.5 <noreply@anthropic.com>
Claude-Session: https://claude.ai/code/session_01672WnJhixnEcarbb7uiwfx
</commit_message>
<xml_diff>
--- a/Zmiany_do_wprowadzenia_w_plikach_zamknietych.docx
+++ b/Zmiany_do_wprowadzenia_w_plikach_zamknietych.docx
@@ -40,7 +40,7 @@
         <w:rPr>
           <w:b w:val="0"/>
         </w:rPr>
-        <w:t xml:space="preserve"> w 2025 r. 95% Amazon i 5% Nara Motors, w pierwszym półroczu 2026 r. 100% Amazon. Nie ma bazy „ponad 50 aktywnych kontrahentów”, więc to sformułowanie znika.</w:t>
+        <w:t xml:space="preserve"> w 2025 r. 95% Amazon i 5% Nara Motors, w pierwszym półroczu 2026 r. 100% Amazon. Decyzja D59 (06.10): baza „ponad 50 kontrahentów” zostaje, ale bez słowa „aktywnych” i bez „bieżącej współpracy”, bo kontrahenci są, lecz nie są obecnie aktywni.</w:t>
       </w:r>
     </w:p>
     <w:p>
@@ -216,7 +216,7 @@
                 <w:b w:val="0"/>
                 <w:sz w:val="18"/>
               </w:rPr>
-              <w:t>„…a kanałem sprzedaż bezpośrednia do operatorów transportowych: trzej z nich podpisali listy intencyjne, a kolejni uczestniczyli w 15 rozmowach handlowych w okresie marzec-maj 2026.”</w:t>
+              <w:t>„…a kanałem sprzedaż bezpośrednia do operatorów transportowych, w tym do bazy ponad 50 kontrahentów Everest11, z którymi spółka współpracowała, także obecnie nieaktywnych: trzej operatorzy podpisali listy intencyjne, a kolejni uczestniczyli w 15 rozmowach handlowych w okresie marzec-maj 2026.”</w:t>
             </w:r>
           </w:p>
         </w:tc>
@@ -278,7 +278,7 @@
                 <w:b w:val="0"/>
                 <w:sz w:val="18"/>
               </w:rPr>
-              <w:t>„…a odpowie na nią sprzedaż bezpośrednia do operatorów transportowych.”</w:t>
+              <w:t>„…a odpowie na nią sprzedaż bezpośrednia do operatorów transportowych, także z bazy kontrahentów Everest11.”</w:t>
             </w:r>
           </w:p>
         </w:tc>
@@ -402,7 +402,7 @@
                 <w:b w:val="0"/>
                 <w:sz w:val="18"/>
               </w:rPr>
-              <w:t>„…do operatorów transportowych, w kontakcie bezpośrednim…”</w:t>
+              <w:t>„…do operatorów transportowych, w tym do bazy ponad 50 kontrahentów Everest11, w kontakcie bezpośrednim…”</w:t>
             </w:r>
           </w:p>
         </w:tc>
@@ -1577,7 +1577,7 @@
         <w:rPr>
           <w:b w:val="0"/>
         </w:rPr>
-        <w:t xml:space="preserve"> Ma 4 problemy wysokiej wagi (poz. 1, 2, 3 i 5 w tabeli 7.3), które albo przeczą naszym decyzjom, albo podają w LSI treść niezgodną z faktami, albo nie dotyczą tekstu, który jest w LSI.</w:t>
+        <w:t xml:space="preserve"> Ma 3 problemy wysokiej wagi (poz. 2, 3 i 5 w tabeli 7.3), które albo przeczą naszym decyzjom, albo podają w LSI treść niezgodną z faktami, albo nie dotyczą tekstu, który jest w LSI.</w:t>
       </w:r>
     </w:p>
     <w:p>
@@ -1796,7 +1796,7 @@
                 <w:b w:val="0"/>
                 <w:sz w:val="18"/>
               </w:rPr>
-              <w:t>NIE</w:t>
+              <w:t>Częściowo</w:t>
             </w:r>
           </w:p>
         </w:tc>
@@ -1811,7 +1811,7 @@
                 <w:b w:val="0"/>
                 <w:sz w:val="18"/>
               </w:rPr>
-              <w:t>Plik utrzymuje bazę „ponad 50 kontrahentów” w 5 miejscach i nie podaje jej struktury, więc nie odpowiada na uwagę, a do tego przeczy D47 (patrz 7.3, poz. 1).</w:t>
+              <w:t>Plik utrzymuje bazę „ponad 50 kontrahentów” (decyzja D59: zostaje) w 5 miejscach, ale pisze o niej jako o aktywnej i nie podaje jej struktury, a uwaga prosi o strukturę (patrz 7.3, poz. 1).</w:t>
             </w:r>
           </w:p>
         </w:tc>
@@ -2601,7 +2601,7 @@
                 <w:b w:val="0"/>
                 <w:sz w:val="18"/>
               </w:rPr>
-              <w:t>WYSOKA</w:t>
+              <w:t>ŚREDNIA</w:t>
             </w:r>
           </w:p>
         </w:tc>
@@ -2616,7 +2616,7 @@
                 <w:b w:val="0"/>
                 <w:sz w:val="18"/>
               </w:rPr>
-              <w:t>1.3 część VI; 2.3 Rynek docelowy („bazę ponad 50 klientów”, „z bazy klientów”); 2.3 Plan, etap 1 („do bazy ponad 50 kontrahentów”) i Strategia („z bazy Everest11”, „konwersją z bazy klientów”); R11 plan zastępczy („aktywnych kontrahentów Everest11”)</w:t>
+              <w:t>1.3 część VI („prowadzi bieżącą współpracę”, „aktywnych kontrahentów”); 2.3 Rynek docelowy („bazę ponad 50 klientów”, „z bazy klientów”); 2.3 Plan, etap 1 („do bazy ponad 50 kontrahentów”) i Strategia („z bazy Everest11”, „konwersją z bazy klientów”); R11 plan zastępczy („aktywnych kontrahentów Everest11”)</w:t>
             </w:r>
           </w:p>
         </w:tc>
@@ -2631,7 +2631,7 @@
                 <w:b w:val="0"/>
                 <w:sz w:val="18"/>
               </w:rPr>
-              <w:t>Sprzedaż Everest11 to w 2025 r. 95% Amazon i 5% Nara Motors, w pierwszym półroczu 2026 r. 100% Amazon. Baza „ponad 50 aktywnych kontrahentów” nie ma pokrycia, a uwaga K2-01 prosi o jej strukturę (ilu przewoźników z pasującymi naczepami, skala flot). To zdanie jest niezgodne z naszymi decyzjami D47 do D49 i jest ryzykiem dla wniosku jako treść nieprawdziwa.</w:t>
+              <w:t>Decyzja D59: baza ponad 50 kontrahentów zostaje, ale nie są to kontrahenci aktywni (w 2025 r. 95% sprzedaży to Amazon i 5% Nara Motors, w I półroczu 2026 r. 100% Amazon). Plik pisze o „aktywnych” i o „bieżącej współpracy”, co jest nieprawdziwe. Uwaga K2-01 prosi o strukturę bazy (ilu przewoźników z pasującymi naczepami, skala flot), a plik jej nie podaje.</w:t>
             </w:r>
           </w:p>
         </w:tc>
@@ -2646,7 +2646,7 @@
                 <w:b w:val="0"/>
                 <w:sz w:val="18"/>
               </w:rPr>
-              <w:t>Zamienić według pozycji 1.1 do 1.4 tego dokumentu: sprzedaż bezpośrednia do operatorów, 15 rozmów marzec-maj 2026, trzy listy intencyjne. W Strategii: „z kontaktów handlowych Everest11” oraz „konwersją z rozmów handlowych”. W R11: „spośród dotychczasowych dostawców usług transportowych Everest11” (pozycja 2.3). Jeśli baza jednak istnieje, potrzebny jest wyciąg z TMS (liczba kontrahentów z obrotem w ostatnich 12 miesiącach, w tym przewoźnicy z flotą 5 do 50 naczep), wtedy zdanie wolno zostawić ze strukturą.</w:t>
+              <w:t>Zostawić bazę, ale usunąć „aktywnych” i „z którymi spółka prowadzi bieżącą współpracę”, np.: „baza ponad 50 kontrahentów Everest11, z którymi spółka współpracowała, także obecnie nieaktywnych”. W Strategii „konwersją z bazy klientów” zamienić na „konwersją z kontaktów handlowych”. W R11 „spośród dotychczasowych dostawców usług transportowych”. Żeby odpowiedzieć na K2-01, potrzebny jest wyciąg z TMS: ilu z 50 to przewoźnicy z flotą 5 do 50 naczep (T55).</w:t>
             </w:r>
           </w:p>
         </w:tc>

</xml_diff>

<commit_message>
Zmiany 8.6: metoda szacowania wyjazdow sluzbowych (stawka jednostkowa), miejsce wpisu
Co-Authored-By: Claude Sonnet 5.5 <noreply@anthropic.com>
Claude-Session: https://claude.ai/code/session_01672WnJhixnEcarbb7uiwfx
</commit_message>
<xml_diff>
--- a/Zmiany_do_wprowadzenia_w_plikach_zamknietych.docx
+++ b/Zmiany_do_wprowadzenia_w_plikach_zamknietych.docx
@@ -5197,6 +5197,161 @@
         <w:t xml:space="preserve"> nadal jedna oferta (JWP z 11.06.2026). Instrukcja wymaga liczby i nazw dostawców, do których wysłano zapytanie, i ich odpowiedzi (T36). Do czasu uzupełnienia metoda szacowania jest niepełna, a nie możemy jej uzupełnić bez dwóch dodatkowych ofert albo publicznych cenników.</w:t>
       </w:r>
     </w:p>
+    <w:p>
+      <w:pPr>
+        <w:pStyle w:val="Heading2"/>
+      </w:pPr>
+      <w:r>
+        <w:t>8.6 Wyjazdy służbowe (stawka 5 489 zł): metoda szacowania i miejsce wpisu</w:t>
+      </w:r>
+    </w:p>
+    <w:p>
+      <w:pPr>
+        <w:keepNext/>
+        <w:spacing w:before="160" w:after="40"/>
+      </w:pPr>
+      <w:r>
+        <w:rPr>
+          <w:b/>
+          <w:sz w:val="20"/>
+        </w:rPr>
+        <w:t>Pozycja 10-4: wyjazd na TRANSLOG Connect Congress, 2 osoby (limit 1500)</w:t>
+      </w:r>
+      <w:r>
+        <w:rPr>
+          <w:color w:val="666666"/>
+          <w:sz w:val="17"/>
+        </w:rPr>
+        <w:t xml:space="preserve"> [960 znaków]</w:t>
+      </w:r>
+    </w:p>
+    <w:p>
+      <w:pPr>
+        <w:spacing w:after="60"/>
+      </w:pPr>
+      <w:r>
+        <w:rPr>
+          <w:b w:val="0"/>
+        </w:rPr>
+        <w:t>Kwotę wyliczono ze stawki jednostkowej z Przewodnika kwalifikowalności (pkt 5.3.3 odsyła do tabeli stawek w pkt 5.3.4), a nie z kosztów rzeczywistych transportu, noclegów i diet. Dla Europy stawka wynosi 5 489,00 zł na osobę na wyjazd (netto równe brutto) i obejmuje transport, noclegi, dojazdy lokalne, diety, ubezpieczenie podróży oraz wizy. Kalkulacja: 2 osoby x 1 wyjazd x 5 489,00 zł = 10 978,00 zł. Budapeszt leży w Europie, a kongres odbędzie się poza siedzibą Everest11 (Warszawa), więc koszty podróży są kwalifikowalne. Liczba osób wynika z zadań delegatów (równoległe prezentacje na stoisku i spotkania 1:1 podczas dwudniowego kongresu), a nie z dostępnego budżetu. Stawka jest wyrażona w PLN, więc nie wymaga kursu waluty, zapytań ofertowych ani cenników, a wydatki ogółem są równe kwalifikowalnym. Rozliczenie nastąpi na podstawie listy uczestników, potwierdzenia rejestracji i dokumentacji z wydarzenia, bez dokumentowania poszczególnych wydatków.</w:t>
+      </w:r>
+    </w:p>
+    <w:p>
+      <w:pPr>
+        <w:keepNext/>
+        <w:spacing w:before="160" w:after="40"/>
+      </w:pPr>
+      <w:r>
+        <w:rPr>
+          <w:b/>
+          <w:sz w:val="20"/>
+        </w:rPr>
+        <w:t>Pozycja 10-5: misja gospodarcza do Czech, 1 osoba (limit 1500)</w:t>
+      </w:r>
+      <w:r>
+        <w:rPr>
+          <w:color w:val="666666"/>
+          <w:sz w:val="17"/>
+        </w:rPr>
+        <w:t xml:space="preserve"> [988 znaków]</w:t>
+      </w:r>
+    </w:p>
+    <w:p>
+      <w:pPr>
+        <w:spacing w:after="60"/>
+      </w:pPr>
+      <w:r>
+        <w:rPr>
+          <w:b w:val="0"/>
+        </w:rPr>
+        <w:t>Kwotę wyliczono ze stawki jednostkowej z Przewodnika kwalifikowalności (pkt 5.3.4, tabela stawek wyjazdów służbowych), a nie z kosztów rzeczywistych transportu, noclegów i diet. Dla Europy stawka wynosi 5 489,00 zł na osobę na wyjazd (netto równe brutto) i obejmuje transport, noclegi, dojazdy lokalne, diety, ubezpieczenie podróży oraz wizy. Kalkulacja: 1 osoba x 1 wyjazd x 5 489,00 zł = 5 489,00 zł. Czechy leżą w Europie, a misja odbędzie się poza siedzibą Everest11 (Warszawa), więc koszty podróży są kwalifikowalne i objęte pomocą de minimis. Liczba osób wynika z zadania delegata (kontynuacja rozmów z dostawcami TMS rozpoczętych na kongresie, bez stoiska i prezentacji sprzętu), a nie z budżetu. Stawka jest wyrażona w PLN, więc nie wymaga kursu waluty, zapytań ofertowych ani cenników, a wydatki ogółem są równe kwalifikowalnym. Rozliczenie nastąpi na podstawie listy uczestników misji, potwierdzenia udziału i dokumentacji ze spotkań, bez dokumentowania poszczególnych wydatków.</w:t>
+      </w:r>
+    </w:p>
+    <w:p>
+      <w:pPr>
+        <w:pStyle w:val="ListBullet"/>
+      </w:pPr>
+      <w:r>
+        <w:rPr>
+          <w:b/>
+        </w:rPr>
+        <w:t>Miejsce wpisu, gdy w generatorze nie ma „Kosztów uproszczonych”:</w:t>
+      </w:r>
+      <w:r>
+        <w:rPr>
+          <w:b w:val="0"/>
+        </w:rPr>
+        <w:t xml:space="preserve"> w wersji C sekcja 3.2.5 istnieje, ale jest pusta („Brak wyników”). Jeżeli w Twoim generatorze nie można w niej dodać pozycji, wpisz obie pozycje w pkt 3.2.3 jako wydatki rzeczywiste, z nazwą kosztu „Wyjazdy służbowe na TRANSLOG Connect Congress w Budapeszcie, 2 osoby (stawka jednostkowa)” i „Wyjazd służbowy na misję gospodarczą do Czech, 1 osoba (stawka jednostkowa)”. Uwaga K3-65 prosi właśnie o rozliczenie „wg stawki jednostkowej, nie jako suma transport + nocleg + diety” i o liczbę osób, więc wpis w 3.2.3 z powyższą metodą ją spełnia.</w:t>
+      </w:r>
+    </w:p>
+    <w:p>
+      <w:pPr>
+        <w:pStyle w:val="ListBullet"/>
+      </w:pPr>
+      <w:r>
+        <w:rPr>
+          <w:b/>
+        </w:rPr>
+        <w:t>Rodzaj pomocy:</w:t>
+      </w:r>
+      <w:r>
+        <w:rPr>
+          <w:b w:val="0"/>
+        </w:rPr>
+        <w:t xml:space="preserve"> kongres, art. 19 GBER (5.3.3); misja, pomoc de minimis (5.3.4, Przewodnik: koszty te są objęte pomocą de minimis). Wydatki ogółem równe kwalifikowalnym (stawka netto równa brutto), VAT kwalifikowalny 0 zł, dofinansowanie 50%.</w:t>
+      </w:r>
+    </w:p>
+    <w:p>
+      <w:pPr>
+        <w:pStyle w:val="ListBullet"/>
+      </w:pPr>
+      <w:r>
+        <w:rPr>
+          <w:b/>
+        </w:rPr>
+        <w:t>Kategoria FENG:</w:t>
+      </w:r>
+      <w:r>
+        <w:rPr>
+          <w:b w:val="0"/>
+        </w:rPr>
+        <w:t xml:space="preserve"> dla kongresu wybierz z listy tę, która zawiera „udział w targach” (zapewne „Usługi zewnętrzne (udział w targach)”, taka była w wersji C), a dla misji tę, która zawiera „misjach wyjazdowych”. Nie wybieraj kategorii „doradztwo”. Jeżeli lista ma tylko kategorię usług, wybierz ją, a w uzasadnieniu napisz „Koszty podróży służbowych rozliczane stawką jednostkową (Przewodnik 5.3.3)” i „…(Przewodnik 5.3.4)”, bo kategoria w LSI i punkt Przewodnika nie muszą się zgadzać nazwą.</w:t>
+      </w:r>
+    </w:p>
+    <w:p>
+      <w:pPr>
+        <w:pStyle w:val="ListBullet"/>
+      </w:pPr>
+      <w:r>
+        <w:rPr>
+          <w:b/>
+        </w:rPr>
+        <w:t>Uzasadnienie pozycji 10-4:</w:t>
+      </w:r>
+      <w:r>
+        <w:rPr>
+          <w:b w:val="0"/>
+        </w:rPr>
+        <w:t xml:space="preserve"> zamień „(Przewodnik 5.3.4)” na „(Przewodnik 5.3.3)”. W 10-5 zostaje 5.3.4.</w:t>
+      </w:r>
+    </w:p>
+    <w:p>
+      <w:pPr>
+        <w:pStyle w:val="ListBullet"/>
+      </w:pPr>
+      <w:r>
+        <w:rPr>
+          <w:b/>
+        </w:rPr>
+        <w:t>Pytanie do helpdesku NCBR (gdybyś chciała potwierdzić):</w:t>
+      </w:r>
+      <w:r>
+        <w:rPr>
+          <w:b w:val="0"/>
+        </w:rPr>
+        <w:t xml:space="preserve"> „W generatorze wniosku (pkt 3.2.3 i 3.2.5) nie ma kategorii kosztów ‘Koszty wsparcia uczestników projektu (udział w targach)’ ani możliwości dodania kosztów uproszczonych w internacjonalizacji. W której sekcji i z jaką kategorią mamy wpisać wyjazdy służbowe rozliczane stawką jednostkową 5 489 zł (Przewodnik 5.3.3 i 5.3.4)?”</w:t>
+      </w:r>
+    </w:p>
     <w:sectPr>
       <w:pgSz w:w="11906" w:h="16838"/>
       <w:pgMar w:top="1134" w:right="1134" w:bottom="1134" w:left="1134" w:header="720" w:footer="720" w:gutter="0"/>

</xml_diff>